<commit_message>
feat: add certificate export
</commit_message>
<xml_diff>
--- a/templates/efl_cert_small.docx
+++ b/templates/efl_cert_small.docx
@@ -10,13 +10,13 @@
         <mc:AlternateContent>
           <mc:Choice Requires="wps">
             <w:drawing>
-              <wp:anchor distT="0" distB="0" distL="114300" distR="114300" simplePos="0" relativeHeight="251661312" behindDoc="0" locked="0" layoutInCell="1" allowOverlap="1" wp14:anchorId="625A86C6" wp14:editId="6F086B30">
+              <wp:anchor distT="0" distB="0" distL="114300" distR="114300" simplePos="0" relativeHeight="251661312" behindDoc="0" locked="0" layoutInCell="1" allowOverlap="1" wp14:anchorId="625A86C6" wp14:editId="2D10669A">
                 <wp:simplePos x="0" y="0"/>
                 <wp:positionH relativeFrom="page">
-                  <wp:posOffset>1188085</wp:posOffset>
+                  <wp:posOffset>1368425</wp:posOffset>
                 </wp:positionH>
                 <wp:positionV relativeFrom="page">
-                  <wp:posOffset>4716780</wp:posOffset>
+                  <wp:posOffset>4644390</wp:posOffset>
                 </wp:positionV>
                 <wp:extent cx="964800" cy="288000"/>
                 <wp:effectExtent l="0" t="0" r="6985" b="0"/>
@@ -105,7 +105,7 @@
                 <v:stroke joinstyle="miter"/>
                 <v:path gradientshapeok="t" o:connecttype="rect"/>
               </v:shapetype>
-              <v:shape id="Text Box 3" o:spid="_x0000_s1026" type="#_x0000_t202" style="position:absolute;margin-left:93.55pt;margin-top:371.4pt;width:75.95pt;height:22.7pt;z-index:251661312;visibility:visible;mso-wrap-style:square;mso-width-percent:0;mso-height-percent:0;mso-wrap-distance-left:9pt;mso-wrap-distance-top:0;mso-wrap-distance-right:9pt;mso-wrap-distance-bottom:0;mso-position-horizontal:absolute;mso-position-horizontal-relative:page;mso-position-vertical:absolute;mso-position-vertical-relative:page;mso-width-percent:0;mso-height-percent:0;mso-width-relative:margin;mso-height-relative:margin;v-text-anchor:middle" o:gfxdata="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" fillcolor="white [3201]" stroked="f" strokeweight=".5pt">
+              <v:shape id="Text Box 3" o:spid="_x0000_s1026" type="#_x0000_t202" style="position:absolute;margin-left:107.75pt;margin-top:365.7pt;width:75.95pt;height:22.7pt;z-index:251661312;visibility:visible;mso-wrap-style:square;mso-width-percent:0;mso-height-percent:0;mso-wrap-distance-left:9pt;mso-wrap-distance-top:0;mso-wrap-distance-right:9pt;mso-wrap-distance-bottom:0;mso-position-horizontal:absolute;mso-position-horizontal-relative:page;mso-position-vertical:absolute;mso-position-vertical-relative:page;mso-width-percent:0;mso-height-percent:0;mso-width-relative:margin;mso-height-relative:margin;v-text-anchor:middle" o:gfxdata="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" fillcolor="white [3201]" stroked="f" strokeweight=".5pt">
                 <v:textbox>
                   <w:txbxContent>
                     <w:p>
@@ -158,13 +158,13 @@
         <mc:AlternateContent>
           <mc:Choice Requires="wps">
             <w:drawing>
-              <wp:anchor distT="0" distB="0" distL="114300" distR="114300" simplePos="0" relativeHeight="251660288" behindDoc="0" locked="0" layoutInCell="1" allowOverlap="1" wp14:anchorId="7704651F" wp14:editId="5E39EB65">
+              <wp:anchor distT="0" distB="0" distL="114300" distR="114300" simplePos="0" relativeHeight="251660288" behindDoc="0" locked="0" layoutInCell="1" allowOverlap="1" wp14:anchorId="7704651F" wp14:editId="579C9517">
                 <wp:simplePos x="0" y="0"/>
                 <wp:positionH relativeFrom="page">
-                  <wp:posOffset>4788535</wp:posOffset>
+                  <wp:posOffset>4968875</wp:posOffset>
                 </wp:positionH>
                 <wp:positionV relativeFrom="page">
-                  <wp:posOffset>2952115</wp:posOffset>
+                  <wp:posOffset>2916555</wp:posOffset>
                 </wp:positionV>
                 <wp:extent cx="432000" cy="288000"/>
                 <wp:effectExtent l="0" t="0" r="6350" b="0"/>
@@ -251,7 +251,7 @@
           </mc:Choice>
           <mc:Fallback>
             <w:pict>
-              <v:shape w14:anchorId="7704651F" id="Text Box 2" o:spid="_x0000_s1027" type="#_x0000_t202" style="position:absolute;margin-left:377.05pt;margin-top:232.45pt;width:34pt;height:22.7pt;z-index:251660288;visibility:visible;mso-wrap-style:square;mso-width-percent:0;mso-height-percent:0;mso-wrap-distance-left:9pt;mso-wrap-distance-top:0;mso-wrap-distance-right:9pt;mso-wrap-distance-bottom:0;mso-position-horizontal:absolute;mso-position-horizontal-relative:page;mso-position-vertical:absolute;mso-position-vertical-relative:page;mso-width-percent:0;mso-height-percent:0;mso-width-relative:margin;mso-height-relative:margin;v-text-anchor:middle" o:gfxdata="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" fillcolor="white [3201]" stroked="f" strokeweight=".5pt">
+              <v:shape w14:anchorId="7704651F" id="Text Box 2" o:spid="_x0000_s1027" type="#_x0000_t202" style="position:absolute;margin-left:391.25pt;margin-top:229.65pt;width:34pt;height:22.7pt;z-index:251660288;visibility:visible;mso-wrap-style:square;mso-width-percent:0;mso-height-percent:0;mso-wrap-distance-left:9pt;mso-wrap-distance-top:0;mso-wrap-distance-right:9pt;mso-wrap-distance-bottom:0;mso-position-horizontal:absolute;mso-position-horizontal-relative:page;mso-position-vertical:absolute;mso-position-vertical-relative:page;mso-width-percent:0;mso-height-percent:0;mso-width-relative:margin;mso-height-relative:margin;v-text-anchor:middle" o:gfxdata="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" fillcolor="white [3201]" stroked="f" strokeweight=".5pt">
                 <v:textbox>
                   <w:txbxContent>
                     <w:p>
@@ -306,13 +306,13 @@
         <mc:AlternateContent>
           <mc:Choice Requires="wps">
             <w:drawing>
-              <wp:anchor distT="0" distB="0" distL="114300" distR="114300" simplePos="0" relativeHeight="251659264" behindDoc="0" locked="0" layoutInCell="1" allowOverlap="1" wp14:anchorId="685C1213" wp14:editId="541FACED">
+              <wp:anchor distT="0" distB="0" distL="114300" distR="114300" simplePos="0" relativeHeight="251659264" behindDoc="0" locked="0" layoutInCell="1" allowOverlap="1" wp14:anchorId="685C1213" wp14:editId="799155FC">
                 <wp:simplePos x="0" y="0"/>
                 <wp:positionH relativeFrom="page">
                   <wp:posOffset>2304415</wp:posOffset>
                 </wp:positionH>
                 <wp:positionV relativeFrom="page">
-                  <wp:posOffset>2520315</wp:posOffset>
+                  <wp:posOffset>2484120</wp:posOffset>
                 </wp:positionV>
                 <wp:extent cx="3024000" cy="468000"/>
                 <wp:effectExtent l="0" t="0" r="5080" b="8255"/>
@@ -414,7 +414,7 @@
           </mc:Choice>
           <mc:Fallback>
             <w:pict>
-              <v:shape w14:anchorId="685C1213" id="Text Box 1" o:spid="_x0000_s1028" type="#_x0000_t202" style="position:absolute;margin-left:181.45pt;margin-top:198.45pt;width:238.1pt;height:36.85pt;z-index:251659264;visibility:visible;mso-wrap-style:square;mso-width-percent:0;mso-height-percent:0;mso-wrap-distance-left:9pt;mso-wrap-distance-top:0;mso-wrap-distance-right:9pt;mso-wrap-distance-bottom:0;mso-position-horizontal:absolute;mso-position-horizontal-relative:page;mso-position-vertical:absolute;mso-position-vertical-relative:page;mso-width-percent:0;mso-height-percent:0;mso-width-relative:margin;mso-height-relative:margin;v-text-anchor:middle" o:gfxdata="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" fillcolor="white [3201]" stroked="f" strokeweight=".5pt">
+              <v:shape w14:anchorId="685C1213" id="Text Box 1" o:spid="_x0000_s1028" type="#_x0000_t202" style="position:absolute;margin-left:181.45pt;margin-top:195.6pt;width:238.1pt;height:36.85pt;z-index:251659264;visibility:visible;mso-wrap-style:square;mso-width-percent:0;mso-height-percent:0;mso-wrap-distance-left:9pt;mso-wrap-distance-top:0;mso-wrap-distance-right:9pt;mso-wrap-distance-bottom:0;mso-position-horizontal:absolute;mso-position-horizontal-relative:page;mso-position-vertical:absolute;mso-position-vertical-relative:page;mso-width-percent:0;mso-height-percent:0;mso-width-relative:margin;mso-height-relative:margin;v-text-anchor:middle" o:gfxdata="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" fillcolor="white [3201]" stroked="f" strokeweight=".5pt">
                 <v:textbox>
                   <w:txbxContent>
                     <w:p>

</xml_diff>